<commit_message>
Lab 4 and 5
</commit_message>
<xml_diff>
--- a/lab_5/questions__lab5_34a_diagnostic.docx
+++ b/lab_5/questions__lab5_34a_diagnostic.docx
@@ -1,6 +1,6 @@
 
 <file path=word/document.xml><?xml version="1.0" encoding="utf-8"?>
-<w:document xmlns:wpc="http://schemas.microsoft.com/office/word/2010/wordprocessingCanvas" xmlns:cx="http://schemas.microsoft.com/office/drawing/2014/chartex" xmlns:cx1="http://schemas.microsoft.com/office/drawing/2015/9/8/chartex" xmlns:cx2="http://schemas.microsoft.com/office/drawing/2015/10/21/chartex" xmlns:cx3="http://schemas.microsoft.com/office/drawing/2016/5/9/chartex" xmlns:cx4="http://schemas.microsoft.com/office/drawing/2016/5/10/chartex" xmlns:cx5="http://schemas.microsoft.com/office/drawing/2016/5/11/chartex" xmlns:cx6="http://schemas.microsoft.com/office/drawing/2016/5/12/chartex" xmlns:cx7="http://schemas.microsoft.com/office/drawing/2016/5/13/chartex" xmlns:cx8="http://schemas.microsoft.com/office/drawing/2016/5/14/chartex" xmlns:mc="http://schemas.openxmlformats.org/markup-compatibility/2006" xmlns:aink="http://schemas.microsoft.com/office/drawing/2016/ink" xmlns:am3d="http://schemas.microsoft.com/office/drawing/2017/model3d" xmlns:o="urn:schemas-microsoft-com:office:office" xmlns:oel="http://schemas.microsoft.com/office/2019/extlst" xmlns:r="http://schemas.openxmlformats.org/officeDocument/2006/relationships" xmlns:m="http://schemas.openxmlformats.org/officeDocument/2006/math" xmlns:v="urn:schemas-microsoft-com:vml" xmlns:wp14="http://schemas.microsoft.com/office/word/2010/wordprocessingDrawing" xmlns:wp="http://schemas.openxmlformats.org/drawingml/2006/wordprocessingDrawing" xmlns:w10="urn:schemas-microsoft-com:office:word" xmlns:w="http://schemas.openxmlformats.org/wordprocessingml/2006/main" xmlns:w14="http://schemas.microsoft.com/office/word/2010/wordml" xmlns:w15="http://schemas.microsoft.com/office/word/2012/wordml" xmlns:w16cei="http://schemas.microsoft.com/office/word/2026/wordml/cei" xmlns:w16cex="http://schemas.microsoft.com/office/word/2018/wordml/cex" xmlns:w16cid="http://schemas.microsoft.com/office/word/2016/wordml/cid" xmlns:w16="http://schemas.microsoft.com/office/word/2018/wordml" xmlns:w16du="http://schemas.microsoft.com/office/word/2023/wordml/word16du" xmlns:w16sdtdh="http://schemas.microsoft.com/office/word/2020/wordml/sdtdatahash" xmlns:w16sdtfl="http://schemas.microsoft.com/office/word/2024/wordml/sdtformatlock" xmlns:w16se="http://schemas.microsoft.com/office/word/2015/wordml/symex" xmlns:wpg="http://schemas.microsoft.com/office/word/2010/wordprocessingGroup" xmlns:wpi="http://schemas.microsoft.com/office/word/2010/wordprocessingInk" xmlns:wne="http://schemas.microsoft.com/office/word/2006/wordml" xmlns:wps="http://schemas.microsoft.com/office/word/2010/wordprocessingShape" mc:Ignorable="w14 w15 w16se w16cid w16 w16cex w16sdtdh w16sdtfl w16du wp14">
+<w:document xmlns:wpc="http://schemas.microsoft.com/office/word/2010/wordprocessingCanvas" xmlns:cx="http://schemas.microsoft.com/office/drawing/2014/chartex" xmlns:cx1="http://schemas.microsoft.com/office/drawing/2015/9/8/chartex" xmlns:cx2="http://schemas.microsoft.com/office/drawing/2015/10/21/chartex" xmlns:cx3="http://schemas.microsoft.com/office/drawing/2016/5/9/chartex" xmlns:cx4="http://schemas.microsoft.com/office/drawing/2016/5/10/chartex" xmlns:cx5="http://schemas.microsoft.com/office/drawing/2016/5/11/chartex" xmlns:cx6="http://schemas.microsoft.com/office/drawing/2016/5/12/chartex" xmlns:cx7="http://schemas.microsoft.com/office/drawing/2016/5/13/chartex" xmlns:cx8="http://schemas.microsoft.com/office/drawing/2016/5/14/chartex" xmlns:mc="http://schemas.openxmlformats.org/markup-compatibility/2006" xmlns:aink="http://schemas.microsoft.com/office/drawing/2016/ink" xmlns:am3d="http://schemas.microsoft.com/office/drawing/2017/model3d" xmlns:o="urn:schemas-microsoft-com:office:office" xmlns:oel="http://schemas.microsoft.com/office/2019/extlst" xmlns:r="http://schemas.openxmlformats.org/officeDocument/2006/relationships" xmlns:m="http://schemas.openxmlformats.org/officeDocument/2006/math" xmlns:v="urn:schemas-microsoft-com:vml" xmlns:wp14="http://schemas.microsoft.com/office/word/2010/wordprocessingDrawing" xmlns:wp="http://schemas.openxmlformats.org/drawingml/2006/wordprocessingDrawing" xmlns:w10="urn:schemas-microsoft-com:office:word" xmlns:w="http://schemas.openxmlformats.org/wordprocessingml/2006/main" xmlns:w14="http://schemas.microsoft.com/office/word/2010/wordml" xmlns:w15="http://schemas.microsoft.com/office/word/2012/wordml" xmlns:w16cex="http://schemas.microsoft.com/office/word/2018/wordml/cex" xmlns:w16cid="http://schemas.microsoft.com/office/word/2016/wordml/cid" xmlns:w16="http://schemas.microsoft.com/office/word/2018/wordml" xmlns:w16du="http://schemas.microsoft.com/office/word/2023/wordml/word16du" xmlns:w16sdtdh="http://schemas.microsoft.com/office/word/2020/wordml/sdtdatahash" xmlns:w16sdtfl="http://schemas.microsoft.com/office/word/2024/wordml/sdtformatlock" xmlns:w16se="http://schemas.microsoft.com/office/word/2015/wordml/symex" xmlns:wpg="http://schemas.microsoft.com/office/word/2010/wordprocessingGroup" xmlns:wpi="http://schemas.microsoft.com/office/word/2010/wordprocessingInk" xmlns:wne="http://schemas.microsoft.com/office/word/2006/wordml" xmlns:wps="http://schemas.microsoft.com/office/word/2010/wordprocessingShape" mc:Ignorable="w14 w15 w16se w16cid w16 w16cex w16sdtdh w16sdtfl w16du wp14">
   <w:body>
     <w:p>
       <w:pPr>
@@ -19,7 +19,19 @@
         <w:rPr>
           <w:lang w:val="fr-CA"/>
         </w:rPr>
-        <w:t>boratoire 1 (243-3</w:t>
+        <w:t xml:space="preserve">boratoire </w:t>
+      </w:r>
+      <w:r>
+        <w:rPr>
+          <w:lang w:val="fr-CA"/>
+        </w:rPr>
+        <w:t>5</w:t>
+      </w:r>
+      <w:r>
+        <w:rPr>
+          <w:lang w:val="fr-CA"/>
+        </w:rPr>
+        <w:t xml:space="preserve"> (243-3</w:t>
       </w:r>
       <w:r>
         <w:rPr>
@@ -37,9 +49,37 @@
     <w:p>
       <w:pPr>
         <w:rPr>
-          <w:lang w:val="fr-CA"/>
-        </w:rPr>
-      </w:pPr>
+          <w:i/>
+          <w:iCs/>
+          <w:lang w:val="fr-CA"/>
+        </w:rPr>
+      </w:pPr>
+      <w:r>
+        <w:rPr>
+          <w:i/>
+          <w:iCs/>
+          <w:lang w:val="fr-CA"/>
+        </w:rPr>
+        <w:t>Soudure Surface Mount (</w:t>
+      </w:r>
+      <w:r>
+        <w:rPr>
+          <w:b/>
+          <w:bCs/>
+          <w:i/>
+          <w:iCs/>
+          <w:lang w:val="fr-CA"/>
+        </w:rPr>
+        <w:t>Avec</w:t>
+      </w:r>
+      <w:r>
+        <w:rPr>
+          <w:i/>
+          <w:iCs/>
+          <w:lang w:val="fr-CA"/>
+        </w:rPr>
+        <w:t xml:space="preserve"> pâte)</w:t>
+      </w:r>
     </w:p>
     <w:p>
       <w:pPr>
@@ -107,50 +147,23 @@
     <w:p>
       <w:pPr>
         <w:rPr>
-          <w:lang w:val="fr-CA"/>
-        </w:rPr>
-      </w:pPr>
-    </w:p>
-    <w:p>
-      <w:pPr>
-        <w:pStyle w:val="Subtitle"/>
-        <w:rPr>
-          <w:lang w:val="fr-CA"/>
-        </w:rPr>
-      </w:pPr>
-      <w:r>
-        <w:rPr>
-          <w:lang w:val="fr-CA"/>
-        </w:rPr>
-        <w:t xml:space="preserve">Partie </w:t>
-      </w:r>
-      <w:r>
-        <w:rPr>
-          <w:lang w:val="fr-CA"/>
-        </w:rPr>
-        <w:t>2</w:t>
-      </w:r>
-    </w:p>
-    <w:p>
-      <w:pPr>
-        <w:rPr>
-          <w:rStyle w:val="SubtleEmphasis"/>
-          <w:lang w:val="fr-CA"/>
-        </w:rPr>
-      </w:pPr>
-      <w:r>
-        <w:rPr>
-          <w:rStyle w:val="SubtleEmphasis"/>
-          <w:lang w:val="fr-CA"/>
-        </w:rPr>
-        <w:t>Question 1:</w:t>
-      </w:r>
-      <w:r>
-        <w:rPr>
-          <w:rStyle w:val="SubtleEmphasis"/>
-          <w:lang w:val="fr-CA"/>
-        </w:rPr>
-        <w:t xml:space="preserve"> </w:t>
+          <w:u w:val="single"/>
+          <w:lang w:val="fr-CA"/>
+        </w:rPr>
+      </w:pPr>
+    </w:p>
+    <w:p>
+      <w:pPr>
+        <w:pStyle w:val="Subtitle"/>
+        <w:rPr>
+          <w:lang w:val="fr-CA"/>
+        </w:rPr>
+      </w:pPr>
+      <w:r>
+        <w:rPr>
+          <w:lang w:val="fr-CA"/>
+        </w:rPr>
+        <w:t>Plan de défectuosité (Pendant le début de la phase 2)</w:t>
       </w:r>
     </w:p>
     <w:p>
@@ -169,11 +182,16 @@
           <w:iCs w:val="0"/>
           <w:lang w:val="fr-CA"/>
         </w:rPr>
-        <w:t>.</w:t>
-      </w:r>
-    </w:p>
-    <w:p>
-      <w:pPr>
+        <w:t>Légende ‘Severity’:</w:t>
+      </w:r>
+    </w:p>
+    <w:p>
+      <w:pPr>
+        <w:pStyle w:val="ListParagraph"/>
+        <w:numPr>
+          <w:ilvl w:val="0"/>
+          <w:numId w:val="1"/>
+        </w:numPr>
         <w:rPr>
           <w:rStyle w:val="SubtleEmphasis"/>
           <w:i w:val="0"/>
@@ -188,11 +206,16 @@
           <w:iCs w:val="0"/>
           <w:lang w:val="fr-CA"/>
         </w:rPr>
-        <w:t>.</w:t>
-      </w:r>
-    </w:p>
-    <w:p>
-      <w:pPr>
+        <w:t>LOW : Esthétique ou erreur minime</w:t>
+      </w:r>
+    </w:p>
+    <w:p>
+      <w:pPr>
+        <w:pStyle w:val="ListParagraph"/>
+        <w:numPr>
+          <w:ilvl w:val="0"/>
+          <w:numId w:val="1"/>
+        </w:numPr>
         <w:rPr>
           <w:rStyle w:val="SubtleEmphasis"/>
           <w:i w:val="0"/>
@@ -207,11 +230,16 @@
           <w:iCs w:val="0"/>
           <w:lang w:val="fr-CA"/>
         </w:rPr>
-        <w:t>.</w:t>
-      </w:r>
-    </w:p>
-    <w:p>
-      <w:pPr>
+        <w:t>MEDIUM : Court-circuit</w:t>
+      </w:r>
+    </w:p>
+    <w:p>
+      <w:pPr>
+        <w:pStyle w:val="ListParagraph"/>
+        <w:numPr>
+          <w:ilvl w:val="0"/>
+          <w:numId w:val="1"/>
+        </w:numPr>
         <w:rPr>
           <w:rStyle w:val="SubtleEmphasis"/>
           <w:i w:val="0"/>
@@ -226,11 +254,16 @@
           <w:iCs w:val="0"/>
           <w:lang w:val="fr-CA"/>
         </w:rPr>
-        <w:t>.</w:t>
-      </w:r>
-    </w:p>
-    <w:p>
-      <w:pPr>
+        <w:t>HIGH : Composant manquants</w:t>
+      </w:r>
+    </w:p>
+    <w:p>
+      <w:pPr>
+        <w:pStyle w:val="ListParagraph"/>
+        <w:numPr>
+          <w:ilvl w:val="0"/>
+          <w:numId w:val="1"/>
+        </w:numPr>
         <w:rPr>
           <w:rStyle w:val="SubtleEmphasis"/>
           <w:i w:val="0"/>
@@ -245,33 +278,17 @@
           <w:iCs w:val="0"/>
           <w:lang w:val="fr-CA"/>
         </w:rPr>
-        <w:t>.</w:t>
-      </w:r>
-    </w:p>
-    <w:p>
-      <w:pPr>
-        <w:rPr>
-          <w:rStyle w:val="SubtleEmphasis"/>
-          <w:lang w:val="fr-CA"/>
-        </w:rPr>
-      </w:pPr>
-      <w:r>
-        <w:rPr>
-          <w:rStyle w:val="SubtleEmphasis"/>
-          <w:lang w:val="fr-CA"/>
-        </w:rPr>
-        <w:t xml:space="preserve">Question 2: </w:t>
-      </w:r>
-    </w:p>
-    <w:p>
-      <w:pPr>
+        <w:t>CRITICAL : Problème d’alimentation, ne peux pas démarrer</w:t>
+      </w:r>
+      <w:r>
         <w:rPr>
           <w:rStyle w:val="SubtleEmphasis"/>
           <w:i w:val="0"/>
           <w:iCs w:val="0"/>
           <w:lang w:val="fr-CA"/>
         </w:rPr>
-      </w:pPr>
+        <w:br/>
+      </w:r>
       <w:r>
         <w:rPr>
           <w:rStyle w:val="SubtleEmphasis"/>
@@ -279,9 +296,955 @@
           <w:iCs w:val="0"/>
           <w:lang w:val="fr-CA"/>
         </w:rPr>
-        <w:t>.</w:t>
-      </w:r>
-    </w:p>
+        <w:br/>
+      </w:r>
+    </w:p>
+    <w:tbl>
+      <w:tblPr>
+        <w:tblStyle w:val="TableGrid"/>
+        <w:tblW w:w="0" w:type="auto"/>
+        <w:tblLook w:val="04A0" w:firstRow="1" w:lastRow="0" w:firstColumn="1" w:lastColumn="0" w:noHBand="0" w:noVBand="1"/>
+      </w:tblPr>
+      <w:tblGrid>
+        <w:gridCol w:w="1617"/>
+        <w:gridCol w:w="1906"/>
+        <w:gridCol w:w="3603"/>
+        <w:gridCol w:w="969"/>
+        <w:gridCol w:w="1255"/>
+      </w:tblGrid>
+      <w:tr>
+        <w:tc>
+          <w:tcPr>
+            <w:tcW w:w="1617" w:type="dxa"/>
+          </w:tcPr>
+          <w:p>
+            <w:pPr>
+              <w:rPr>
+                <w:rStyle w:val="SubtleEmphasis"/>
+                <w:b/>
+                <w:bCs/>
+                <w:i w:val="0"/>
+                <w:iCs w:val="0"/>
+                <w:lang w:val="fr-CA"/>
+              </w:rPr>
+            </w:pPr>
+            <w:r>
+              <w:rPr>
+                <w:rStyle w:val="SubtleEmphasis"/>
+                <w:b/>
+                <w:bCs/>
+                <w:i w:val="0"/>
+                <w:iCs w:val="0"/>
+                <w:lang w:val="fr-CA"/>
+              </w:rPr>
+              <w:t>Defect tracker</w:t>
+            </w:r>
+          </w:p>
+        </w:tc>
+        <w:tc>
+          <w:tcPr>
+            <w:tcW w:w="1922" w:type="dxa"/>
+          </w:tcPr>
+          <w:p>
+            <w:pPr>
+              <w:rPr>
+                <w:rStyle w:val="SubtleEmphasis"/>
+                <w:i w:val="0"/>
+                <w:iCs w:val="0"/>
+                <w:lang w:val="fr-CA"/>
+              </w:rPr>
+            </w:pPr>
+          </w:p>
+        </w:tc>
+        <w:tc>
+          <w:tcPr>
+            <w:tcW w:w="3686" w:type="dxa"/>
+          </w:tcPr>
+          <w:p>
+            <w:pPr>
+              <w:rPr>
+                <w:rStyle w:val="SubtleEmphasis"/>
+                <w:i w:val="0"/>
+                <w:iCs w:val="0"/>
+                <w:lang w:val="fr-CA"/>
+              </w:rPr>
+            </w:pPr>
+          </w:p>
+        </w:tc>
+        <w:tc>
+          <w:tcPr>
+            <w:tcW w:w="850" w:type="dxa"/>
+          </w:tcPr>
+          <w:p>
+            <w:pPr>
+              <w:rPr>
+                <w:rStyle w:val="SubtleEmphasis"/>
+                <w:i w:val="0"/>
+                <w:iCs w:val="0"/>
+                <w:lang w:val="fr-CA"/>
+              </w:rPr>
+            </w:pPr>
+          </w:p>
+        </w:tc>
+        <w:tc>
+          <w:tcPr>
+            <w:tcW w:w="1275" w:type="dxa"/>
+          </w:tcPr>
+          <w:p>
+            <w:pPr>
+              <w:rPr>
+                <w:rStyle w:val="SubtleEmphasis"/>
+                <w:i w:val="0"/>
+                <w:iCs w:val="0"/>
+                <w:lang w:val="fr-CA"/>
+              </w:rPr>
+            </w:pPr>
+          </w:p>
+        </w:tc>
+      </w:tr>
+      <w:tr>
+        <w:tc>
+          <w:tcPr>
+            <w:tcW w:w="1617" w:type="dxa"/>
+          </w:tcPr>
+          <w:p>
+            <w:pPr>
+              <w:rPr>
+                <w:rStyle w:val="SubtleEmphasis"/>
+                <w:b/>
+                <w:bCs/>
+                <w:i w:val="0"/>
+                <w:iCs w:val="0"/>
+                <w:lang w:val="fr-CA"/>
+              </w:rPr>
+            </w:pPr>
+            <w:r>
+              <w:rPr>
+                <w:rStyle w:val="SubtleEmphasis"/>
+                <w:b/>
+                <w:bCs/>
+                <w:i w:val="0"/>
+                <w:iCs w:val="0"/>
+                <w:lang w:val="fr-CA"/>
+              </w:rPr>
+              <w:t>TECHNICIAN :</w:t>
+            </w:r>
+          </w:p>
+        </w:tc>
+        <w:tc>
+          <w:tcPr>
+            <w:tcW w:w="1922" w:type="dxa"/>
+          </w:tcPr>
+          <w:p>
+            <w:pPr>
+              <w:rPr>
+                <w:rStyle w:val="SubtleEmphasis"/>
+                <w:i w:val="0"/>
+                <w:iCs w:val="0"/>
+                <w:lang w:val="fr-CA"/>
+              </w:rPr>
+            </w:pPr>
+            <w:r>
+              <w:rPr>
+                <w:rStyle w:val="SubtleEmphasis"/>
+                <w:i w:val="0"/>
+                <w:iCs w:val="0"/>
+                <w:lang w:val="fr-CA"/>
+              </w:rPr>
+              <w:t>VOTRE NOM</w:t>
+            </w:r>
+          </w:p>
+        </w:tc>
+        <w:tc>
+          <w:tcPr>
+            <w:tcW w:w="3686" w:type="dxa"/>
+          </w:tcPr>
+          <w:p>
+            <w:pPr>
+              <w:rPr>
+                <w:rStyle w:val="SubtleEmphasis"/>
+                <w:i w:val="0"/>
+                <w:iCs w:val="0"/>
+                <w:lang w:val="fr-CA"/>
+              </w:rPr>
+            </w:pPr>
+          </w:p>
+        </w:tc>
+        <w:tc>
+          <w:tcPr>
+            <w:tcW w:w="850" w:type="dxa"/>
+          </w:tcPr>
+          <w:p>
+            <w:pPr>
+              <w:rPr>
+                <w:rStyle w:val="SubtleEmphasis"/>
+                <w:i w:val="0"/>
+                <w:iCs w:val="0"/>
+                <w:lang w:val="fr-CA"/>
+              </w:rPr>
+            </w:pPr>
+          </w:p>
+        </w:tc>
+        <w:tc>
+          <w:tcPr>
+            <w:tcW w:w="1275" w:type="dxa"/>
+          </w:tcPr>
+          <w:p>
+            <w:pPr>
+              <w:rPr>
+                <w:rStyle w:val="SubtleEmphasis"/>
+                <w:i w:val="0"/>
+                <w:iCs w:val="0"/>
+                <w:lang w:val="fr-CA"/>
+              </w:rPr>
+            </w:pPr>
+          </w:p>
+        </w:tc>
+      </w:tr>
+      <w:tr>
+        <w:tc>
+          <w:tcPr>
+            <w:tcW w:w="1617" w:type="dxa"/>
+          </w:tcPr>
+          <w:p>
+            <w:pPr>
+              <w:rPr>
+                <w:rStyle w:val="SubtleEmphasis"/>
+                <w:i w:val="0"/>
+                <w:iCs w:val="0"/>
+                <w:lang w:val="fr-CA"/>
+              </w:rPr>
+            </w:pPr>
+          </w:p>
+        </w:tc>
+        <w:tc>
+          <w:tcPr>
+            <w:tcW w:w="1922" w:type="dxa"/>
+          </w:tcPr>
+          <w:p>
+            <w:pPr>
+              <w:rPr>
+                <w:rStyle w:val="SubtleEmphasis"/>
+                <w:i w:val="0"/>
+                <w:iCs w:val="0"/>
+                <w:lang w:val="fr-CA"/>
+              </w:rPr>
+            </w:pPr>
+          </w:p>
+        </w:tc>
+        <w:tc>
+          <w:tcPr>
+            <w:tcW w:w="3686" w:type="dxa"/>
+          </w:tcPr>
+          <w:p>
+            <w:pPr>
+              <w:rPr>
+                <w:rStyle w:val="SubtleEmphasis"/>
+                <w:i w:val="0"/>
+                <w:iCs w:val="0"/>
+                <w:lang w:val="fr-CA"/>
+              </w:rPr>
+            </w:pPr>
+          </w:p>
+        </w:tc>
+        <w:tc>
+          <w:tcPr>
+            <w:tcW w:w="850" w:type="dxa"/>
+          </w:tcPr>
+          <w:p>
+            <w:pPr>
+              <w:rPr>
+                <w:rStyle w:val="SubtleEmphasis"/>
+                <w:i w:val="0"/>
+                <w:iCs w:val="0"/>
+                <w:lang w:val="fr-CA"/>
+              </w:rPr>
+            </w:pPr>
+          </w:p>
+        </w:tc>
+        <w:tc>
+          <w:tcPr>
+            <w:tcW w:w="1275" w:type="dxa"/>
+          </w:tcPr>
+          <w:p>
+            <w:pPr>
+              <w:rPr>
+                <w:rStyle w:val="SubtleEmphasis"/>
+                <w:i w:val="0"/>
+                <w:iCs w:val="0"/>
+                <w:lang w:val="fr-CA"/>
+              </w:rPr>
+            </w:pPr>
+          </w:p>
+        </w:tc>
+      </w:tr>
+      <w:tr>
+        <w:tc>
+          <w:tcPr>
+            <w:tcW w:w="1617" w:type="dxa"/>
+          </w:tcPr>
+          <w:p>
+            <w:pPr>
+              <w:rPr>
+                <w:rStyle w:val="SubtleEmphasis"/>
+                <w:i w:val="0"/>
+                <w:iCs w:val="0"/>
+                <w:lang w:val="fr-CA"/>
+              </w:rPr>
+            </w:pPr>
+            <w:r>
+              <w:rPr>
+                <w:rStyle w:val="SubtleEmphasis"/>
+                <w:i w:val="0"/>
+                <w:iCs w:val="0"/>
+                <w:lang w:val="fr-CA"/>
+              </w:rPr>
+              <w:t>Defect ID</w:t>
+            </w:r>
+          </w:p>
+        </w:tc>
+        <w:tc>
+          <w:tcPr>
+            <w:tcW w:w="1922" w:type="dxa"/>
+          </w:tcPr>
+          <w:p>
+            <w:pPr>
+              <w:rPr>
+                <w:rStyle w:val="SubtleEmphasis"/>
+                <w:i w:val="0"/>
+                <w:iCs w:val="0"/>
+                <w:lang w:val="fr-CA"/>
+              </w:rPr>
+            </w:pPr>
+            <w:r>
+              <w:rPr>
+                <w:rStyle w:val="SubtleEmphasis"/>
+                <w:i w:val="0"/>
+                <w:iCs w:val="0"/>
+                <w:lang w:val="fr-CA"/>
+              </w:rPr>
+              <w:t>Components</w:t>
+            </w:r>
+          </w:p>
+        </w:tc>
+        <w:tc>
+          <w:tcPr>
+            <w:tcW w:w="3686" w:type="dxa"/>
+          </w:tcPr>
+          <w:p>
+            <w:pPr>
+              <w:rPr>
+                <w:rStyle w:val="SubtleEmphasis"/>
+                <w:i w:val="0"/>
+                <w:iCs w:val="0"/>
+                <w:lang w:val="fr-CA"/>
+              </w:rPr>
+            </w:pPr>
+            <w:r>
+              <w:rPr>
+                <w:rStyle w:val="SubtleEmphasis"/>
+                <w:i w:val="0"/>
+                <w:iCs w:val="0"/>
+                <w:lang w:val="fr-CA"/>
+              </w:rPr>
+              <w:t>Description</w:t>
+            </w:r>
+          </w:p>
+        </w:tc>
+        <w:tc>
+          <w:tcPr>
+            <w:tcW w:w="850" w:type="dxa"/>
+          </w:tcPr>
+          <w:p>
+            <w:pPr>
+              <w:rPr>
+                <w:rStyle w:val="SubtleEmphasis"/>
+                <w:i w:val="0"/>
+                <w:iCs w:val="0"/>
+                <w:lang w:val="fr-CA"/>
+              </w:rPr>
+            </w:pPr>
+            <w:r>
+              <w:rPr>
+                <w:rStyle w:val="SubtleEmphasis"/>
+                <w:i w:val="0"/>
+                <w:iCs w:val="0"/>
+                <w:lang w:val="fr-CA"/>
+              </w:rPr>
+              <w:t>Severity</w:t>
+            </w:r>
+          </w:p>
+        </w:tc>
+        <w:tc>
+          <w:tcPr>
+            <w:tcW w:w="1275" w:type="dxa"/>
+          </w:tcPr>
+          <w:p>
+            <w:pPr>
+              <w:rPr>
+                <w:rStyle w:val="SubtleEmphasis"/>
+                <w:i w:val="0"/>
+                <w:iCs w:val="0"/>
+                <w:lang w:val="fr-CA"/>
+              </w:rPr>
+            </w:pPr>
+            <w:r>
+              <w:rPr>
+                <w:rStyle w:val="SubtleEmphasis"/>
+                <w:i w:val="0"/>
+                <w:iCs w:val="0"/>
+                <w:lang w:val="fr-CA"/>
+              </w:rPr>
+              <w:t>F</w:t>
+            </w:r>
+            <w:r>
+              <w:rPr>
+                <w:rStyle w:val="SubtleEmphasis"/>
+                <w:i w:val="0"/>
+                <w:iCs w:val="0"/>
+              </w:rPr>
+              <w:t>ix?</w:t>
+            </w:r>
+            <w:r>
+              <w:rPr>
+                <w:rStyle w:val="SubtleEmphasis"/>
+                <w:i w:val="0"/>
+                <w:iCs w:val="0"/>
+              </w:rPr>
+              <w:t xml:space="preserve"> (Y</w:t>
+            </w:r>
+            <w:r>
+              <w:rPr>
+                <w:rStyle w:val="SubtleEmphasis"/>
+              </w:rPr>
+              <w:t>/N)</w:t>
+            </w:r>
+          </w:p>
+        </w:tc>
+      </w:tr>
+      <w:tr>
+        <w:tc>
+          <w:tcPr>
+            <w:tcW w:w="1617" w:type="dxa"/>
+          </w:tcPr>
+          <w:p>
+            <w:pPr>
+              <w:rPr>
+                <w:rStyle w:val="SubtleEmphasis"/>
+                <w:i w:val="0"/>
+                <w:iCs w:val="0"/>
+                <w:lang w:val="fr-CA"/>
+              </w:rPr>
+            </w:pPr>
+            <w:r>
+              <w:rPr>
+                <w:rStyle w:val="SubtleEmphasis"/>
+                <w:i w:val="0"/>
+                <w:iCs w:val="0"/>
+                <w:lang w:val="fr-CA"/>
+              </w:rPr>
+              <w:t>1</w:t>
+            </w:r>
+          </w:p>
+        </w:tc>
+        <w:tc>
+          <w:tcPr>
+            <w:tcW w:w="1922" w:type="dxa"/>
+          </w:tcPr>
+          <w:p>
+            <w:pPr>
+              <w:rPr>
+                <w:rStyle w:val="SubtleEmphasis"/>
+                <w:i w:val="0"/>
+                <w:iCs w:val="0"/>
+                <w:lang w:val="fr-CA"/>
+              </w:rPr>
+            </w:pPr>
+          </w:p>
+        </w:tc>
+        <w:tc>
+          <w:tcPr>
+            <w:tcW w:w="3686" w:type="dxa"/>
+          </w:tcPr>
+          <w:p>
+            <w:pPr>
+              <w:rPr>
+                <w:rStyle w:val="SubtleEmphasis"/>
+                <w:i w:val="0"/>
+                <w:iCs w:val="0"/>
+                <w:lang w:val="fr-CA"/>
+              </w:rPr>
+            </w:pPr>
+          </w:p>
+        </w:tc>
+        <w:tc>
+          <w:tcPr>
+            <w:tcW w:w="850" w:type="dxa"/>
+          </w:tcPr>
+          <w:p>
+            <w:pPr>
+              <w:rPr>
+                <w:rStyle w:val="SubtleEmphasis"/>
+                <w:i w:val="0"/>
+                <w:iCs w:val="0"/>
+                <w:lang w:val="fr-CA"/>
+              </w:rPr>
+            </w:pPr>
+          </w:p>
+        </w:tc>
+        <w:tc>
+          <w:tcPr>
+            <w:tcW w:w="1275" w:type="dxa"/>
+          </w:tcPr>
+          <w:p>
+            <w:pPr>
+              <w:rPr>
+                <w:rStyle w:val="SubtleEmphasis"/>
+                <w:i w:val="0"/>
+                <w:iCs w:val="0"/>
+                <w:lang w:val="fr-CA"/>
+              </w:rPr>
+            </w:pPr>
+          </w:p>
+        </w:tc>
+      </w:tr>
+      <w:tr>
+        <w:tc>
+          <w:tcPr>
+            <w:tcW w:w="1617" w:type="dxa"/>
+          </w:tcPr>
+          <w:p>
+            <w:pPr>
+              <w:rPr>
+                <w:rStyle w:val="SubtleEmphasis"/>
+                <w:i w:val="0"/>
+                <w:iCs w:val="0"/>
+                <w:lang w:val="fr-CA"/>
+              </w:rPr>
+            </w:pPr>
+            <w:r>
+              <w:rPr>
+                <w:rStyle w:val="SubtleEmphasis"/>
+                <w:i w:val="0"/>
+                <w:iCs w:val="0"/>
+                <w:lang w:val="fr-CA"/>
+              </w:rPr>
+              <w:t>2</w:t>
+            </w:r>
+          </w:p>
+        </w:tc>
+        <w:tc>
+          <w:tcPr>
+            <w:tcW w:w="1922" w:type="dxa"/>
+          </w:tcPr>
+          <w:p>
+            <w:pPr>
+              <w:rPr>
+                <w:rStyle w:val="SubtleEmphasis"/>
+                <w:i w:val="0"/>
+                <w:iCs w:val="0"/>
+                <w:lang w:val="fr-CA"/>
+              </w:rPr>
+            </w:pPr>
+          </w:p>
+        </w:tc>
+        <w:tc>
+          <w:tcPr>
+            <w:tcW w:w="3686" w:type="dxa"/>
+          </w:tcPr>
+          <w:p>
+            <w:pPr>
+              <w:rPr>
+                <w:rStyle w:val="SubtleEmphasis"/>
+                <w:i w:val="0"/>
+                <w:iCs w:val="0"/>
+                <w:lang w:val="fr-CA"/>
+              </w:rPr>
+            </w:pPr>
+          </w:p>
+        </w:tc>
+        <w:tc>
+          <w:tcPr>
+            <w:tcW w:w="850" w:type="dxa"/>
+          </w:tcPr>
+          <w:p>
+            <w:pPr>
+              <w:rPr>
+                <w:rStyle w:val="SubtleEmphasis"/>
+                <w:i w:val="0"/>
+                <w:iCs w:val="0"/>
+                <w:lang w:val="fr-CA"/>
+              </w:rPr>
+            </w:pPr>
+          </w:p>
+        </w:tc>
+        <w:tc>
+          <w:tcPr>
+            <w:tcW w:w="1275" w:type="dxa"/>
+          </w:tcPr>
+          <w:p>
+            <w:pPr>
+              <w:rPr>
+                <w:rStyle w:val="SubtleEmphasis"/>
+                <w:i w:val="0"/>
+                <w:iCs w:val="0"/>
+                <w:lang w:val="fr-CA"/>
+              </w:rPr>
+            </w:pPr>
+          </w:p>
+        </w:tc>
+      </w:tr>
+      <w:tr>
+        <w:tc>
+          <w:tcPr>
+            <w:tcW w:w="1617" w:type="dxa"/>
+          </w:tcPr>
+          <w:p>
+            <w:pPr>
+              <w:rPr>
+                <w:rStyle w:val="SubtleEmphasis"/>
+                <w:i w:val="0"/>
+                <w:iCs w:val="0"/>
+                <w:lang w:val="fr-CA"/>
+              </w:rPr>
+            </w:pPr>
+            <w:r>
+              <w:rPr>
+                <w:rStyle w:val="SubtleEmphasis"/>
+                <w:i w:val="0"/>
+                <w:iCs w:val="0"/>
+                <w:lang w:val="fr-CA"/>
+              </w:rPr>
+              <w:t>3</w:t>
+            </w:r>
+          </w:p>
+        </w:tc>
+        <w:tc>
+          <w:tcPr>
+            <w:tcW w:w="1922" w:type="dxa"/>
+          </w:tcPr>
+          <w:p>
+            <w:pPr>
+              <w:rPr>
+                <w:rStyle w:val="SubtleEmphasis"/>
+                <w:i w:val="0"/>
+                <w:iCs w:val="0"/>
+                <w:lang w:val="fr-CA"/>
+              </w:rPr>
+            </w:pPr>
+          </w:p>
+        </w:tc>
+        <w:tc>
+          <w:tcPr>
+            <w:tcW w:w="3686" w:type="dxa"/>
+          </w:tcPr>
+          <w:p>
+            <w:pPr>
+              <w:rPr>
+                <w:rStyle w:val="SubtleEmphasis"/>
+                <w:i w:val="0"/>
+                <w:iCs w:val="0"/>
+                <w:lang w:val="fr-CA"/>
+              </w:rPr>
+            </w:pPr>
+          </w:p>
+        </w:tc>
+        <w:tc>
+          <w:tcPr>
+            <w:tcW w:w="850" w:type="dxa"/>
+          </w:tcPr>
+          <w:p>
+            <w:pPr>
+              <w:rPr>
+                <w:rStyle w:val="SubtleEmphasis"/>
+                <w:i w:val="0"/>
+                <w:iCs w:val="0"/>
+                <w:lang w:val="fr-CA"/>
+              </w:rPr>
+            </w:pPr>
+          </w:p>
+        </w:tc>
+        <w:tc>
+          <w:tcPr>
+            <w:tcW w:w="1275" w:type="dxa"/>
+          </w:tcPr>
+          <w:p>
+            <w:pPr>
+              <w:rPr>
+                <w:rStyle w:val="SubtleEmphasis"/>
+                <w:i w:val="0"/>
+                <w:iCs w:val="0"/>
+                <w:lang w:val="fr-CA"/>
+              </w:rPr>
+            </w:pPr>
+          </w:p>
+        </w:tc>
+      </w:tr>
+      <w:tr>
+        <w:tc>
+          <w:tcPr>
+            <w:tcW w:w="1617" w:type="dxa"/>
+          </w:tcPr>
+          <w:p>
+            <w:pPr>
+              <w:rPr>
+                <w:rStyle w:val="SubtleEmphasis"/>
+                <w:i w:val="0"/>
+                <w:iCs w:val="0"/>
+                <w:lang w:val="fr-CA"/>
+              </w:rPr>
+            </w:pPr>
+            <w:r>
+              <w:rPr>
+                <w:rStyle w:val="SubtleEmphasis"/>
+                <w:i w:val="0"/>
+                <w:iCs w:val="0"/>
+                <w:lang w:val="fr-CA"/>
+              </w:rPr>
+              <w:t>4</w:t>
+            </w:r>
+          </w:p>
+        </w:tc>
+        <w:tc>
+          <w:tcPr>
+            <w:tcW w:w="1922" w:type="dxa"/>
+          </w:tcPr>
+          <w:p>
+            <w:pPr>
+              <w:rPr>
+                <w:rStyle w:val="SubtleEmphasis"/>
+                <w:i w:val="0"/>
+                <w:iCs w:val="0"/>
+                <w:lang w:val="fr-CA"/>
+              </w:rPr>
+            </w:pPr>
+          </w:p>
+        </w:tc>
+        <w:tc>
+          <w:tcPr>
+            <w:tcW w:w="3686" w:type="dxa"/>
+          </w:tcPr>
+          <w:p>
+            <w:pPr>
+              <w:rPr>
+                <w:rStyle w:val="SubtleEmphasis"/>
+                <w:i w:val="0"/>
+                <w:iCs w:val="0"/>
+                <w:lang w:val="fr-CA"/>
+              </w:rPr>
+            </w:pPr>
+          </w:p>
+        </w:tc>
+        <w:tc>
+          <w:tcPr>
+            <w:tcW w:w="850" w:type="dxa"/>
+          </w:tcPr>
+          <w:p>
+            <w:pPr>
+              <w:rPr>
+                <w:rStyle w:val="SubtleEmphasis"/>
+                <w:i w:val="0"/>
+                <w:iCs w:val="0"/>
+                <w:lang w:val="fr-CA"/>
+              </w:rPr>
+            </w:pPr>
+          </w:p>
+        </w:tc>
+        <w:tc>
+          <w:tcPr>
+            <w:tcW w:w="1275" w:type="dxa"/>
+          </w:tcPr>
+          <w:p>
+            <w:pPr>
+              <w:rPr>
+                <w:rStyle w:val="SubtleEmphasis"/>
+                <w:i w:val="0"/>
+                <w:iCs w:val="0"/>
+                <w:lang w:val="fr-CA"/>
+              </w:rPr>
+            </w:pPr>
+          </w:p>
+        </w:tc>
+      </w:tr>
+      <w:tr>
+        <w:tc>
+          <w:tcPr>
+            <w:tcW w:w="1617" w:type="dxa"/>
+          </w:tcPr>
+          <w:p>
+            <w:pPr>
+              <w:rPr>
+                <w:rStyle w:val="SubtleEmphasis"/>
+                <w:i w:val="0"/>
+                <w:iCs w:val="0"/>
+                <w:lang w:val="fr-CA"/>
+              </w:rPr>
+            </w:pPr>
+            <w:r>
+              <w:rPr>
+                <w:rStyle w:val="SubtleEmphasis"/>
+                <w:i w:val="0"/>
+                <w:iCs w:val="0"/>
+                <w:lang w:val="fr-CA"/>
+              </w:rPr>
+              <w:t>5</w:t>
+            </w:r>
+          </w:p>
+        </w:tc>
+        <w:tc>
+          <w:tcPr>
+            <w:tcW w:w="1922" w:type="dxa"/>
+          </w:tcPr>
+          <w:p>
+            <w:pPr>
+              <w:rPr>
+                <w:rStyle w:val="SubtleEmphasis"/>
+                <w:i w:val="0"/>
+                <w:iCs w:val="0"/>
+                <w:lang w:val="fr-CA"/>
+              </w:rPr>
+            </w:pPr>
+          </w:p>
+        </w:tc>
+        <w:tc>
+          <w:tcPr>
+            <w:tcW w:w="3686" w:type="dxa"/>
+          </w:tcPr>
+          <w:p>
+            <w:pPr>
+              <w:rPr>
+                <w:rStyle w:val="SubtleEmphasis"/>
+                <w:i w:val="0"/>
+                <w:iCs w:val="0"/>
+                <w:lang w:val="fr-CA"/>
+              </w:rPr>
+            </w:pPr>
+          </w:p>
+        </w:tc>
+        <w:tc>
+          <w:tcPr>
+            <w:tcW w:w="850" w:type="dxa"/>
+          </w:tcPr>
+          <w:p>
+            <w:pPr>
+              <w:rPr>
+                <w:rStyle w:val="SubtleEmphasis"/>
+                <w:i w:val="0"/>
+                <w:iCs w:val="0"/>
+                <w:lang w:val="fr-CA"/>
+              </w:rPr>
+            </w:pPr>
+          </w:p>
+        </w:tc>
+        <w:tc>
+          <w:tcPr>
+            <w:tcW w:w="1275" w:type="dxa"/>
+          </w:tcPr>
+          <w:p>
+            <w:pPr>
+              <w:rPr>
+                <w:rStyle w:val="SubtleEmphasis"/>
+                <w:i w:val="0"/>
+                <w:iCs w:val="0"/>
+                <w:lang w:val="fr-CA"/>
+              </w:rPr>
+            </w:pPr>
+          </w:p>
+        </w:tc>
+      </w:tr>
+      <w:tr>
+        <w:tc>
+          <w:tcPr>
+            <w:tcW w:w="1617" w:type="dxa"/>
+          </w:tcPr>
+          <w:p>
+            <w:pPr>
+              <w:rPr>
+                <w:rStyle w:val="SubtleEmphasis"/>
+                <w:i w:val="0"/>
+                <w:iCs w:val="0"/>
+                <w:lang w:val="fr-CA"/>
+              </w:rPr>
+            </w:pPr>
+            <w:r>
+              <w:rPr>
+                <w:rStyle w:val="SubtleEmphasis"/>
+                <w:i w:val="0"/>
+                <w:iCs w:val="0"/>
+                <w:lang w:val="fr-CA"/>
+              </w:rPr>
+              <w:t>…</w:t>
+            </w:r>
+            <w:r>
+              <w:rPr>
+                <w:rStyle w:val="SubtleEmphasis"/>
+              </w:rPr>
+              <w:t>.</w:t>
+            </w:r>
+          </w:p>
+        </w:tc>
+        <w:tc>
+          <w:tcPr>
+            <w:tcW w:w="1922" w:type="dxa"/>
+          </w:tcPr>
+          <w:p>
+            <w:pPr>
+              <w:rPr>
+                <w:rStyle w:val="SubtleEmphasis"/>
+                <w:i w:val="0"/>
+                <w:iCs w:val="0"/>
+                <w:lang w:val="fr-CA"/>
+              </w:rPr>
+            </w:pPr>
+          </w:p>
+        </w:tc>
+        <w:tc>
+          <w:tcPr>
+            <w:tcW w:w="3686" w:type="dxa"/>
+          </w:tcPr>
+          <w:p>
+            <w:pPr>
+              <w:rPr>
+                <w:rStyle w:val="SubtleEmphasis"/>
+                <w:i w:val="0"/>
+                <w:iCs w:val="0"/>
+                <w:lang w:val="fr-CA"/>
+              </w:rPr>
+            </w:pPr>
+          </w:p>
+        </w:tc>
+        <w:tc>
+          <w:tcPr>
+            <w:tcW w:w="850" w:type="dxa"/>
+          </w:tcPr>
+          <w:p>
+            <w:pPr>
+              <w:rPr>
+                <w:rStyle w:val="SubtleEmphasis"/>
+                <w:i w:val="0"/>
+                <w:iCs w:val="0"/>
+                <w:lang w:val="fr-CA"/>
+              </w:rPr>
+            </w:pPr>
+          </w:p>
+        </w:tc>
+        <w:tc>
+          <w:tcPr>
+            <w:tcW w:w="1275" w:type="dxa"/>
+          </w:tcPr>
+          <w:p>
+            <w:pPr>
+              <w:rPr>
+                <w:rStyle w:val="SubtleEmphasis"/>
+                <w:i w:val="0"/>
+                <w:iCs w:val="0"/>
+                <w:lang w:val="fr-CA"/>
+              </w:rPr>
+            </w:pPr>
+          </w:p>
+        </w:tc>
+      </w:tr>
+    </w:tbl>
     <w:p>
       <w:pPr>
         <w:rPr>
@@ -291,15 +1254,16 @@
           <w:lang w:val="fr-CA"/>
         </w:rPr>
       </w:pPr>
-      <w:r>
+    </w:p>
+    <w:p>
+      <w:pPr>
         <w:rPr>
           <w:rStyle w:val="SubtleEmphasis"/>
           <w:i w:val="0"/>
           <w:iCs w:val="0"/>
           <w:lang w:val="fr-CA"/>
         </w:rPr>
-        <w:t>.</w:t>
-      </w:r>
+      </w:pPr>
     </w:p>
     <w:p>
       <w:pPr>
@@ -310,15 +1274,16 @@
           <w:lang w:val="fr-CA"/>
         </w:rPr>
       </w:pPr>
-      <w:r>
+    </w:p>
+    <w:p>
+      <w:pPr>
         <w:rPr>
           <w:rStyle w:val="SubtleEmphasis"/>
           <w:i w:val="0"/>
           <w:iCs w:val="0"/>
           <w:lang w:val="fr-CA"/>
         </w:rPr>
-        <w:t>.</w:t>
-      </w:r>
+      </w:pPr>
     </w:p>
     <w:p>
       <w:pPr>
@@ -329,15 +1294,16 @@
           <w:lang w:val="fr-CA"/>
         </w:rPr>
       </w:pPr>
-      <w:r>
+    </w:p>
+    <w:p>
+      <w:pPr>
         <w:rPr>
           <w:rStyle w:val="SubtleEmphasis"/>
           <w:i w:val="0"/>
           <w:iCs w:val="0"/>
           <w:lang w:val="fr-CA"/>
         </w:rPr>
-        <w:t>.</w:t>
-      </w:r>
+      </w:pPr>
     </w:p>
     <w:p>
       <w:pPr>
@@ -348,15 +1314,16 @@
           <w:lang w:val="fr-CA"/>
         </w:rPr>
       </w:pPr>
-      <w:r>
+    </w:p>
+    <w:p>
+      <w:pPr>
         <w:rPr>
           <w:rStyle w:val="SubtleEmphasis"/>
           <w:i w:val="0"/>
           <w:iCs w:val="0"/>
           <w:lang w:val="fr-CA"/>
         </w:rPr>
-        <w:t>.</w:t>
-      </w:r>
+      </w:pPr>
     </w:p>
     <w:p>
       <w:pPr>
@@ -370,134 +1337,48 @@
     </w:p>
     <w:p>
       <w:pPr>
-        <w:rPr>
-          <w:rStyle w:val="SubtleEmphasis"/>
-          <w:i w:val="0"/>
-          <w:iCs w:val="0"/>
-          <w:lang w:val="fr-CA"/>
-        </w:rPr>
-      </w:pPr>
-    </w:p>
-    <w:p>
-      <w:pPr>
-        <w:rPr>
-          <w:rStyle w:val="SubtleEmphasis"/>
-          <w:i w:val="0"/>
-          <w:iCs w:val="0"/>
-          <w:lang w:val="fr-CA"/>
-        </w:rPr>
-      </w:pPr>
-    </w:p>
-    <w:p>
-      <w:pPr>
-        <w:rPr>
-          <w:rStyle w:val="SubtleEmphasis"/>
-          <w:i w:val="0"/>
-          <w:iCs w:val="0"/>
-          <w:lang w:val="fr-CA"/>
-        </w:rPr>
-      </w:pPr>
-    </w:p>
-    <w:p>
-      <w:pPr>
-        <w:rPr>
-          <w:rStyle w:val="SubtleEmphasis"/>
-          <w:i w:val="0"/>
-          <w:iCs w:val="0"/>
-          <w:lang w:val="fr-CA"/>
-        </w:rPr>
-      </w:pPr>
-    </w:p>
-    <w:p>
-      <w:pPr>
-        <w:rPr>
-          <w:rStyle w:val="SubtleEmphasis"/>
-          <w:i w:val="0"/>
-          <w:iCs w:val="0"/>
-          <w:lang w:val="fr-CA"/>
-        </w:rPr>
-      </w:pPr>
-    </w:p>
-    <w:p>
-      <w:pPr>
-        <w:rPr>
-          <w:rStyle w:val="SubtleEmphasis"/>
-          <w:i w:val="0"/>
-          <w:iCs w:val="0"/>
-          <w:lang w:val="fr-CA"/>
-        </w:rPr>
-      </w:pPr>
-    </w:p>
-    <w:p>
-      <w:pPr>
-        <w:rPr>
-          <w:rStyle w:val="SubtleEmphasis"/>
-          <w:i w:val="0"/>
-          <w:iCs w:val="0"/>
-          <w:lang w:val="fr-CA"/>
-        </w:rPr>
-      </w:pPr>
-    </w:p>
-    <w:p>
-      <w:pPr>
-        <w:rPr>
-          <w:rStyle w:val="SubtleEmphasis"/>
-          <w:i w:val="0"/>
-          <w:iCs w:val="0"/>
-          <w:lang w:val="fr-CA"/>
-        </w:rPr>
-      </w:pPr>
-    </w:p>
-    <w:p>
-      <w:pPr>
-        <w:pStyle w:val="Subtitle"/>
-        <w:rPr>
-          <w:lang w:val="fr-CA"/>
-        </w:rPr>
-      </w:pPr>
-      <w:r>
-        <w:rPr>
+        <w:pStyle w:val="Subtitle"/>
+        <w:rPr>
+          <w:color w:val="404040" w:themeColor="text1" w:themeTint="BF"/>
+          <w:lang w:val="fr-CA"/>
+        </w:rPr>
+      </w:pPr>
+      <w:r>
+        <w:rPr>
+          <w:color w:val="404040" w:themeColor="text1" w:themeTint="BF"/>
           <w:lang w:val="fr-CA"/>
         </w:rPr>
         <w:lastRenderedPageBreak/>
-        <w:t xml:space="preserve">Partie </w:t>
-      </w:r>
-      <w:r>
-        <w:rPr>
-          <w:lang w:val="fr-CA"/>
-        </w:rPr>
-        <w:t>3</w:t>
-      </w:r>
-    </w:p>
-    <w:p>
-      <w:pPr>
-        <w:rPr>
-          <w:rStyle w:val="SubtleEmphasis"/>
-          <w:lang w:val="fr-CA"/>
-        </w:rPr>
-      </w:pPr>
-      <w:r>
-        <w:rPr>
-          <w:rStyle w:val="SubtleEmphasis"/>
-          <w:lang w:val="fr-CA"/>
-        </w:rPr>
-        <w:t xml:space="preserve">Question 1: </w:t>
-      </w:r>
-    </w:p>
-    <w:p>
-      <w:pPr>
-        <w:rPr>
-          <w:rStyle w:val="SubtleEmphasis"/>
-          <w:i w:val="0"/>
-          <w:iCs w:val="0"/>
-          <w:lang w:val="fr-CA"/>
-        </w:rPr>
-      </w:pPr>
-      <w:r>
-        <w:rPr>
-          <w:rStyle w:val="SubtleEmphasis"/>
-          <w:i w:val="0"/>
-          <w:iCs w:val="0"/>
+        <w:t>Photo de votre PCB (Avant debugging) :</w:t>
+      </w:r>
+    </w:p>
+    <w:p>
+      <w:pPr>
+        <w:pStyle w:val="Subtitle"/>
+        <w:rPr>
+          <w:color w:val="404040" w:themeColor="text1" w:themeTint="BF"/>
+          <w:lang w:val="fr-CA"/>
+        </w:rPr>
+      </w:pPr>
+      <w:r>
+        <w:rPr>
+          <w:color w:val="404040" w:themeColor="text1" w:themeTint="BF"/>
+          <w:lang w:val="fr-CA"/>
+        </w:rPr>
+        <w:t>Recto :</w:t>
+      </w:r>
+    </w:p>
+    <w:p>
+      <w:pPr>
+        <w:pStyle w:val="Subtitle"/>
+        <w:rPr>
+          <w:color w:val="404040" w:themeColor="text1" w:themeTint="BF"/>
+          <w:lang w:val="fr-CA"/>
+        </w:rPr>
+      </w:pPr>
+      <w:r>
+        <w:rPr>
+          <w:color w:val="404040" w:themeColor="text1" w:themeTint="BF"/>
           <w:lang w:val="fr-CA"/>
         </w:rPr>
         <w:t>.</w:t>
@@ -505,18 +1386,15 @@
     </w:p>
     <w:p>
       <w:pPr>
-        <w:rPr>
-          <w:rStyle w:val="SubtleEmphasis"/>
-          <w:i w:val="0"/>
-          <w:iCs w:val="0"/>
-          <w:lang w:val="fr-CA"/>
-        </w:rPr>
-      </w:pPr>
-      <w:r>
-        <w:rPr>
-          <w:rStyle w:val="SubtleEmphasis"/>
-          <w:i w:val="0"/>
-          <w:iCs w:val="0"/>
+        <w:pStyle w:val="Subtitle"/>
+        <w:rPr>
+          <w:color w:val="404040" w:themeColor="text1" w:themeTint="BF"/>
+          <w:lang w:val="fr-CA"/>
+        </w:rPr>
+      </w:pPr>
+      <w:r>
+        <w:rPr>
+          <w:color w:val="404040" w:themeColor="text1" w:themeTint="BF"/>
           <w:lang w:val="fr-CA"/>
         </w:rPr>
         <w:t>.</w:t>
@@ -524,18 +1402,15 @@
     </w:p>
     <w:p>
       <w:pPr>
-        <w:rPr>
-          <w:rStyle w:val="SubtleEmphasis"/>
-          <w:i w:val="0"/>
-          <w:iCs w:val="0"/>
-          <w:lang w:val="fr-CA"/>
-        </w:rPr>
-      </w:pPr>
-      <w:r>
-        <w:rPr>
-          <w:rStyle w:val="SubtleEmphasis"/>
-          <w:i w:val="0"/>
-          <w:iCs w:val="0"/>
+        <w:pStyle w:val="Subtitle"/>
+        <w:rPr>
+          <w:color w:val="404040" w:themeColor="text1" w:themeTint="BF"/>
+          <w:lang w:val="fr-CA"/>
+        </w:rPr>
+      </w:pPr>
+      <w:r>
+        <w:rPr>
+          <w:color w:val="404040" w:themeColor="text1" w:themeTint="BF"/>
           <w:lang w:val="fr-CA"/>
         </w:rPr>
         <w:t>.</w:t>
@@ -543,33 +1418,15 @@
     </w:p>
     <w:p>
       <w:pPr>
-        <w:rPr>
-          <w:rStyle w:val="SubtleEmphasis"/>
-          <w:lang w:val="fr-CA"/>
-        </w:rPr>
-      </w:pPr>
-      <w:r>
-        <w:rPr>
-          <w:rStyle w:val="SubtleEmphasis"/>
-          <w:lang w:val="fr-CA"/>
-        </w:rPr>
-        <w:t xml:space="preserve">Question 2: </w:t>
-      </w:r>
-    </w:p>
-    <w:p>
-      <w:pPr>
-        <w:rPr>
-          <w:rStyle w:val="SubtleEmphasis"/>
-          <w:i w:val="0"/>
-          <w:iCs w:val="0"/>
-          <w:lang w:val="fr-CA"/>
-        </w:rPr>
-      </w:pPr>
-      <w:r>
-        <w:rPr>
-          <w:rStyle w:val="SubtleEmphasis"/>
-          <w:i w:val="0"/>
-          <w:iCs w:val="0"/>
+        <w:pStyle w:val="Subtitle"/>
+        <w:rPr>
+          <w:color w:val="404040" w:themeColor="text1" w:themeTint="BF"/>
+          <w:lang w:val="fr-CA"/>
+        </w:rPr>
+      </w:pPr>
+      <w:r>
+        <w:rPr>
+          <w:color w:val="404040" w:themeColor="text1" w:themeTint="BF"/>
           <w:lang w:val="fr-CA"/>
         </w:rPr>
         <w:t>.</w:t>
@@ -577,18 +1434,31 @@
     </w:p>
     <w:p>
       <w:pPr>
-        <w:rPr>
-          <w:rStyle w:val="SubtleEmphasis"/>
-          <w:i w:val="0"/>
-          <w:iCs w:val="0"/>
-          <w:lang w:val="fr-CA"/>
-        </w:rPr>
-      </w:pPr>
-      <w:r>
-        <w:rPr>
-          <w:rStyle w:val="SubtleEmphasis"/>
-          <w:i w:val="0"/>
-          <w:iCs w:val="0"/>
+        <w:pStyle w:val="Subtitle"/>
+        <w:rPr>
+          <w:color w:val="404040" w:themeColor="text1" w:themeTint="BF"/>
+          <w:lang w:val="fr-CA"/>
+        </w:rPr>
+      </w:pPr>
+      <w:r>
+        <w:rPr>
+          <w:color w:val="404040" w:themeColor="text1" w:themeTint="BF"/>
+          <w:lang w:val="fr-CA"/>
+        </w:rPr>
+        <w:t>Verso :</w:t>
+      </w:r>
+    </w:p>
+    <w:p>
+      <w:pPr>
+        <w:pStyle w:val="Subtitle"/>
+        <w:rPr>
+          <w:color w:val="404040" w:themeColor="text1" w:themeTint="BF"/>
+          <w:lang w:val="fr-CA"/>
+        </w:rPr>
+      </w:pPr>
+      <w:r>
+        <w:rPr>
+          <w:color w:val="404040" w:themeColor="text1" w:themeTint="BF"/>
           <w:lang w:val="fr-CA"/>
         </w:rPr>
         <w:t>.</w:t>
@@ -596,18 +1466,15 @@
     </w:p>
     <w:p>
       <w:pPr>
-        <w:rPr>
-          <w:rStyle w:val="SubtleEmphasis"/>
-          <w:i w:val="0"/>
-          <w:iCs w:val="0"/>
-          <w:lang w:val="fr-CA"/>
-        </w:rPr>
-      </w:pPr>
-      <w:r>
-        <w:rPr>
-          <w:rStyle w:val="SubtleEmphasis"/>
-          <w:i w:val="0"/>
-          <w:iCs w:val="0"/>
+        <w:pStyle w:val="Subtitle"/>
+        <w:rPr>
+          <w:color w:val="404040" w:themeColor="text1" w:themeTint="BF"/>
+          <w:lang w:val="fr-CA"/>
+        </w:rPr>
+      </w:pPr>
+      <w:r>
+        <w:rPr>
+          <w:color w:val="404040" w:themeColor="text1" w:themeTint="BF"/>
           <w:lang w:val="fr-CA"/>
         </w:rPr>
         <w:t>.</w:t>
@@ -615,47 +1482,15 @@
     </w:p>
     <w:p>
       <w:pPr>
-        <w:rPr>
-          <w:rStyle w:val="SubtleEmphasis"/>
-          <w:lang w:val="fr-CA"/>
-        </w:rPr>
-      </w:pPr>
-      <w:r>
-        <w:rPr>
-          <w:rStyle w:val="SubtleEmphasis"/>
-          <w:lang w:val="fr-CA"/>
-        </w:rPr>
-        <w:t xml:space="preserve">Question </w:t>
-      </w:r>
-      <w:r>
-        <w:rPr>
-          <w:rStyle w:val="SubtleEmphasis"/>
-          <w:lang w:val="fr-CA"/>
-        </w:rPr>
-        <w:t>3</w:t>
-      </w:r>
-      <w:r>
-        <w:rPr>
-          <w:rStyle w:val="SubtleEmphasis"/>
-          <w:lang w:val="fr-CA"/>
-        </w:rPr>
-        <w:t xml:space="preserve">: </w:t>
-      </w:r>
-    </w:p>
-    <w:p>
-      <w:pPr>
-        <w:rPr>
-          <w:rStyle w:val="SubtleEmphasis"/>
-          <w:i w:val="0"/>
-          <w:iCs w:val="0"/>
-          <w:lang w:val="fr-CA"/>
-        </w:rPr>
-      </w:pPr>
-      <w:r>
-        <w:rPr>
-          <w:rStyle w:val="SubtleEmphasis"/>
-          <w:i w:val="0"/>
-          <w:iCs w:val="0"/>
+        <w:pStyle w:val="Subtitle"/>
+        <w:rPr>
+          <w:color w:val="404040" w:themeColor="text1" w:themeTint="BF"/>
+          <w:lang w:val="fr-CA"/>
+        </w:rPr>
+      </w:pPr>
+      <w:r>
+        <w:rPr>
+          <w:color w:val="404040" w:themeColor="text1" w:themeTint="BF"/>
           <w:lang w:val="fr-CA"/>
         </w:rPr>
         <w:t>.</w:t>
@@ -663,18 +1498,15 @@
     </w:p>
     <w:p>
       <w:pPr>
-        <w:rPr>
-          <w:rStyle w:val="SubtleEmphasis"/>
-          <w:i w:val="0"/>
-          <w:iCs w:val="0"/>
-          <w:lang w:val="fr-CA"/>
-        </w:rPr>
-      </w:pPr>
-      <w:r>
-        <w:rPr>
-          <w:rStyle w:val="SubtleEmphasis"/>
-          <w:i w:val="0"/>
-          <w:iCs w:val="0"/>
+        <w:pStyle w:val="Subtitle"/>
+        <w:rPr>
+          <w:color w:val="404040" w:themeColor="text1" w:themeTint="BF"/>
+          <w:lang w:val="fr-CA"/>
+        </w:rPr>
+      </w:pPr>
+      <w:r>
+        <w:rPr>
+          <w:color w:val="404040" w:themeColor="text1" w:themeTint="BF"/>
           <w:lang w:val="fr-CA"/>
         </w:rPr>
         <w:t>.</w:t>
@@ -682,18 +1514,56 @@
     </w:p>
     <w:p>
       <w:pPr>
-        <w:rPr>
-          <w:rStyle w:val="SubtleEmphasis"/>
-          <w:i w:val="0"/>
-          <w:iCs w:val="0"/>
-          <w:lang w:val="fr-CA"/>
-        </w:rPr>
-      </w:pPr>
-      <w:r>
-        <w:rPr>
-          <w:rStyle w:val="SubtleEmphasis"/>
-          <w:i w:val="0"/>
-          <w:iCs w:val="0"/>
+        <w:pStyle w:val="Subtitle"/>
+        <w:rPr>
+          <w:color w:val="404040" w:themeColor="text1" w:themeTint="BF"/>
+          <w:lang w:val="fr-CA"/>
+        </w:rPr>
+      </w:pPr>
+    </w:p>
+    <w:p>
+      <w:pPr>
+        <w:pStyle w:val="Subtitle"/>
+        <w:rPr>
+          <w:color w:val="404040" w:themeColor="text1" w:themeTint="BF"/>
+          <w:lang w:val="fr-CA"/>
+        </w:rPr>
+      </w:pPr>
+      <w:r>
+        <w:rPr>
+          <w:color w:val="404040" w:themeColor="text1" w:themeTint="BF"/>
+          <w:lang w:val="fr-CA"/>
+        </w:rPr>
+        <w:t>Photo de votre PCB (Après debugging) :</w:t>
+      </w:r>
+    </w:p>
+    <w:p>
+      <w:pPr>
+        <w:pStyle w:val="Subtitle"/>
+        <w:rPr>
+          <w:color w:val="404040" w:themeColor="text1" w:themeTint="BF"/>
+          <w:lang w:val="fr-CA"/>
+        </w:rPr>
+      </w:pPr>
+      <w:r>
+        <w:rPr>
+          <w:color w:val="404040" w:themeColor="text1" w:themeTint="BF"/>
+          <w:lang w:val="fr-CA"/>
+        </w:rPr>
+        <w:t>Recto :</w:t>
+      </w:r>
+    </w:p>
+    <w:p>
+      <w:pPr>
+        <w:pStyle w:val="Subtitle"/>
+        <w:rPr>
+          <w:color w:val="404040" w:themeColor="text1" w:themeTint="BF"/>
+          <w:lang w:val="fr-CA"/>
+        </w:rPr>
+      </w:pPr>
+      <w:r>
+        <w:rPr>
+          <w:color w:val="404040" w:themeColor="text1" w:themeTint="BF"/>
           <w:lang w:val="fr-CA"/>
         </w:rPr>
         <w:t>.</w:t>
@@ -701,73 +1571,15 @@
     </w:p>
     <w:p>
       <w:pPr>
-        <w:rPr>
-          <w:rStyle w:val="SubtleEmphasis"/>
-          <w:i w:val="0"/>
-          <w:iCs w:val="0"/>
-          <w:lang w:val="fr-CA"/>
-        </w:rPr>
-      </w:pPr>
-    </w:p>
-    <w:p>
-      <w:pPr>
-        <w:rPr>
-          <w:rStyle w:val="SubtleEmphasis"/>
-          <w:i w:val="0"/>
-          <w:iCs w:val="0"/>
-          <w:lang w:val="fr-CA"/>
-        </w:rPr>
-      </w:pPr>
-    </w:p>
-    <w:p>
-      <w:pPr>
-        <w:pStyle w:val="Subtitle"/>
-        <w:rPr>
-          <w:lang w:val="fr-CA"/>
-        </w:rPr>
-      </w:pPr>
-      <w:r>
-        <w:rPr>
-          <w:lang w:val="fr-CA"/>
-        </w:rPr>
-        <w:t xml:space="preserve">Partie </w:t>
-      </w:r>
-      <w:r>
-        <w:rPr>
-          <w:lang w:val="fr-CA"/>
-        </w:rPr>
-        <w:t>4</w:t>
-      </w:r>
-    </w:p>
-    <w:p>
-      <w:pPr>
-        <w:rPr>
-          <w:rStyle w:val="SubtleEmphasis"/>
-          <w:lang w:val="fr-CA"/>
-        </w:rPr>
-      </w:pPr>
-      <w:r>
-        <w:rPr>
-          <w:rStyle w:val="SubtleEmphasis"/>
-          <w:lang w:val="fr-CA"/>
-        </w:rPr>
-        <w:t xml:space="preserve">Question 1: </w:t>
-      </w:r>
-    </w:p>
-    <w:p>
-      <w:pPr>
-        <w:rPr>
-          <w:rStyle w:val="SubtleEmphasis"/>
-          <w:i w:val="0"/>
-          <w:iCs w:val="0"/>
-          <w:lang w:val="fr-CA"/>
-        </w:rPr>
-      </w:pPr>
-      <w:r>
-        <w:rPr>
-          <w:rStyle w:val="SubtleEmphasis"/>
-          <w:i w:val="0"/>
-          <w:iCs w:val="0"/>
+        <w:pStyle w:val="Subtitle"/>
+        <w:rPr>
+          <w:color w:val="404040" w:themeColor="text1" w:themeTint="BF"/>
+          <w:lang w:val="fr-CA"/>
+        </w:rPr>
+      </w:pPr>
+      <w:r>
+        <w:rPr>
+          <w:color w:val="404040" w:themeColor="text1" w:themeTint="BF"/>
           <w:lang w:val="fr-CA"/>
         </w:rPr>
         <w:t>.</w:t>
@@ -775,18 +1587,15 @@
     </w:p>
     <w:p>
       <w:pPr>
-        <w:rPr>
-          <w:rStyle w:val="SubtleEmphasis"/>
-          <w:i w:val="0"/>
-          <w:iCs w:val="0"/>
-          <w:lang w:val="fr-CA"/>
-        </w:rPr>
-      </w:pPr>
-      <w:r>
-        <w:rPr>
-          <w:rStyle w:val="SubtleEmphasis"/>
-          <w:i w:val="0"/>
-          <w:iCs w:val="0"/>
+        <w:pStyle w:val="Subtitle"/>
+        <w:rPr>
+          <w:color w:val="404040" w:themeColor="text1" w:themeTint="BF"/>
+          <w:lang w:val="fr-CA"/>
+        </w:rPr>
+      </w:pPr>
+      <w:r>
+        <w:rPr>
+          <w:color w:val="404040" w:themeColor="text1" w:themeTint="BF"/>
           <w:lang w:val="fr-CA"/>
         </w:rPr>
         <w:t>.</w:t>
@@ -794,18 +1603,15 @@
     </w:p>
     <w:p>
       <w:pPr>
-        <w:rPr>
-          <w:rStyle w:val="SubtleEmphasis"/>
-          <w:i w:val="0"/>
-          <w:iCs w:val="0"/>
-          <w:lang w:val="fr-CA"/>
-        </w:rPr>
-      </w:pPr>
-      <w:r>
-        <w:rPr>
-          <w:rStyle w:val="SubtleEmphasis"/>
-          <w:i w:val="0"/>
-          <w:iCs w:val="0"/>
+        <w:pStyle w:val="Subtitle"/>
+        <w:rPr>
+          <w:color w:val="404040" w:themeColor="text1" w:themeTint="BF"/>
+          <w:lang w:val="fr-CA"/>
+        </w:rPr>
+      </w:pPr>
+      <w:r>
+        <w:rPr>
+          <w:color w:val="404040" w:themeColor="text1" w:themeTint="BF"/>
           <w:lang w:val="fr-CA"/>
         </w:rPr>
         <w:t>.</w:t>
@@ -813,18 +1619,31 @@
     </w:p>
     <w:p>
       <w:pPr>
-        <w:rPr>
-          <w:rStyle w:val="SubtleEmphasis"/>
-          <w:i w:val="0"/>
-          <w:iCs w:val="0"/>
-          <w:lang w:val="fr-CA"/>
-        </w:rPr>
-      </w:pPr>
-      <w:r>
-        <w:rPr>
-          <w:rStyle w:val="SubtleEmphasis"/>
-          <w:i w:val="0"/>
-          <w:iCs w:val="0"/>
+        <w:pStyle w:val="Subtitle"/>
+        <w:rPr>
+          <w:color w:val="404040" w:themeColor="text1" w:themeTint="BF"/>
+          <w:lang w:val="fr-CA"/>
+        </w:rPr>
+      </w:pPr>
+      <w:r>
+        <w:rPr>
+          <w:color w:val="404040" w:themeColor="text1" w:themeTint="BF"/>
+          <w:lang w:val="fr-CA"/>
+        </w:rPr>
+        <w:t>Verso :</w:t>
+      </w:r>
+    </w:p>
+    <w:p>
+      <w:pPr>
+        <w:pStyle w:val="Subtitle"/>
+        <w:rPr>
+          <w:color w:val="404040" w:themeColor="text1" w:themeTint="BF"/>
+          <w:lang w:val="fr-CA"/>
+        </w:rPr>
+      </w:pPr>
+      <w:r>
+        <w:rPr>
+          <w:color w:val="404040" w:themeColor="text1" w:themeTint="BF"/>
           <w:lang w:val="fr-CA"/>
         </w:rPr>
         <w:t>.</w:t>
@@ -832,18 +1651,15 @@
     </w:p>
     <w:p>
       <w:pPr>
-        <w:rPr>
-          <w:rStyle w:val="SubtleEmphasis"/>
-          <w:i w:val="0"/>
-          <w:iCs w:val="0"/>
-          <w:lang w:val="fr-CA"/>
-        </w:rPr>
-      </w:pPr>
-      <w:r>
-        <w:rPr>
-          <w:rStyle w:val="SubtleEmphasis"/>
-          <w:i w:val="0"/>
-          <w:iCs w:val="0"/>
+        <w:pStyle w:val="Subtitle"/>
+        <w:rPr>
+          <w:color w:val="404040" w:themeColor="text1" w:themeTint="BF"/>
+          <w:lang w:val="fr-CA"/>
+        </w:rPr>
+      </w:pPr>
+      <w:r>
+        <w:rPr>
+          <w:color w:val="404040" w:themeColor="text1" w:themeTint="BF"/>
           <w:lang w:val="fr-CA"/>
         </w:rPr>
         <w:t>.</w:t>
@@ -851,26 +1667,269 @@
     </w:p>
     <w:p>
       <w:pPr>
-        <w:rPr>
-          <w:rStyle w:val="SubtleEmphasis"/>
-          <w:i w:val="0"/>
-          <w:iCs w:val="0"/>
-          <w:lang w:val="fr-CA"/>
-        </w:rPr>
-      </w:pPr>
-    </w:p>
-    <w:p>
-      <w:pPr>
-        <w:rPr>
-          <w:rStyle w:val="SubtleEmphasis"/>
-          <w:i w:val="0"/>
-          <w:iCs w:val="0"/>
-          <w:lang w:val="fr-CA"/>
-        </w:rPr>
-      </w:pPr>
-    </w:p>
-    <w:p>
-      <w:pPr>
+        <w:pStyle w:val="Subtitle"/>
+        <w:rPr>
+          <w:color w:val="404040" w:themeColor="text1" w:themeTint="BF"/>
+          <w:lang w:val="fr-CA"/>
+        </w:rPr>
+      </w:pPr>
+      <w:r>
+        <w:rPr>
+          <w:color w:val="404040" w:themeColor="text1" w:themeTint="BF"/>
+          <w:lang w:val="fr-CA"/>
+        </w:rPr>
+        <w:t>.</w:t>
+      </w:r>
+    </w:p>
+    <w:p>
+      <w:pPr>
+        <w:pStyle w:val="Subtitle"/>
+        <w:rPr>
+          <w:color w:val="404040" w:themeColor="text1" w:themeTint="BF"/>
+          <w:lang w:val="fr-CA"/>
+        </w:rPr>
+      </w:pPr>
+      <w:r>
+        <w:rPr>
+          <w:color w:val="404040" w:themeColor="text1" w:themeTint="BF"/>
+          <w:lang w:val="fr-CA"/>
+        </w:rPr>
+        <w:t>.</w:t>
+      </w:r>
+    </w:p>
+    <w:p>
+      <w:pPr>
+        <w:pStyle w:val="Subtitle"/>
+        <w:rPr>
+          <w:color w:val="404040" w:themeColor="text1" w:themeTint="BF"/>
+          <w:lang w:val="fr-CA"/>
+        </w:rPr>
+      </w:pPr>
+    </w:p>
+    <w:p>
+      <w:pPr>
+        <w:pStyle w:val="Subtitle"/>
+        <w:rPr>
+          <w:color w:val="404040" w:themeColor="text1" w:themeTint="BF"/>
+          <w:lang w:val="fr-CA"/>
+        </w:rPr>
+      </w:pPr>
+    </w:p>
+    <w:p>
+      <w:pPr>
+        <w:pStyle w:val="Subtitle"/>
+        <w:rPr>
+          <w:color w:val="404040" w:themeColor="text1" w:themeTint="BF"/>
+          <w:lang w:val="fr-CA"/>
+        </w:rPr>
+      </w:pPr>
+    </w:p>
+    <w:p>
+      <w:pPr>
+        <w:pStyle w:val="Subtitle"/>
+        <w:rPr>
+          <w:color w:val="404040" w:themeColor="text1" w:themeTint="BF"/>
+          <w:lang w:val="fr-CA"/>
+        </w:rPr>
+      </w:pPr>
+    </w:p>
+    <w:p>
+      <w:pPr>
+        <w:pStyle w:val="Subtitle"/>
+        <w:rPr>
+          <w:color w:val="404040" w:themeColor="text1" w:themeTint="BF"/>
+          <w:lang w:val="fr-CA"/>
+        </w:rPr>
+      </w:pPr>
+    </w:p>
+    <w:p>
+      <w:pPr>
+        <w:pStyle w:val="Subtitle"/>
+        <w:rPr>
+          <w:color w:val="404040" w:themeColor="text1" w:themeTint="BF"/>
+          <w:lang w:val="fr-CA"/>
+        </w:rPr>
+      </w:pPr>
+      <w:r>
+        <w:rPr>
+          <w:color w:val="404040" w:themeColor="text1" w:themeTint="BF"/>
+          <w:lang w:val="fr-CA"/>
+        </w:rPr>
+        <w:t>Oscilloscope :</w:t>
+      </w:r>
+    </w:p>
+    <w:p>
+      <w:pPr>
+        <w:pStyle w:val="Subtitle"/>
+        <w:rPr>
+          <w:color w:val="404040" w:themeColor="text1" w:themeTint="BF"/>
+          <w:lang w:val="fr-CA"/>
+        </w:rPr>
+      </w:pPr>
+      <w:r>
+        <w:rPr>
+          <w:color w:val="404040" w:themeColor="text1" w:themeTint="BF"/>
+          <w:lang w:val="fr-CA"/>
+        </w:rPr>
+        <w:t>Onde carrée du 555 :</w:t>
+      </w:r>
+    </w:p>
+    <w:p>
+      <w:pPr>
+        <w:pStyle w:val="Subtitle"/>
+        <w:rPr>
+          <w:color w:val="404040" w:themeColor="text1" w:themeTint="BF"/>
+          <w:lang w:val="fr-CA"/>
+        </w:rPr>
+      </w:pPr>
+      <w:r>
+        <w:rPr>
+          <w:color w:val="404040" w:themeColor="text1" w:themeTint="BF"/>
+          <w:lang w:val="fr-CA"/>
+        </w:rPr>
+        <w:t>.</w:t>
+      </w:r>
+    </w:p>
+    <w:p>
+      <w:pPr>
+        <w:pStyle w:val="Subtitle"/>
+        <w:rPr>
+          <w:color w:val="404040" w:themeColor="text1" w:themeTint="BF"/>
+          <w:lang w:val="fr-CA"/>
+        </w:rPr>
+      </w:pPr>
+      <w:r>
+        <w:rPr>
+          <w:color w:val="404040" w:themeColor="text1" w:themeTint="BF"/>
+          <w:lang w:val="fr-CA"/>
+        </w:rPr>
+        <w:t>.</w:t>
+      </w:r>
+    </w:p>
+    <w:p>
+      <w:pPr>
+        <w:pStyle w:val="Subtitle"/>
+        <w:rPr>
+          <w:color w:val="404040" w:themeColor="text1" w:themeTint="BF"/>
+          <w:lang w:val="fr-CA"/>
+        </w:rPr>
+      </w:pPr>
+      <w:r>
+        <w:rPr>
+          <w:color w:val="404040" w:themeColor="text1" w:themeTint="BF"/>
+          <w:lang w:val="fr-CA"/>
+        </w:rPr>
+        <w:t>.</w:t>
+      </w:r>
+    </w:p>
+    <w:p>
+      <w:pPr>
+        <w:pStyle w:val="Subtitle"/>
+        <w:rPr>
+          <w:color w:val="404040" w:themeColor="text1" w:themeTint="BF"/>
+          <w:lang w:val="fr-CA"/>
+        </w:rPr>
+      </w:pPr>
+      <w:r>
+        <w:rPr>
+          <w:color w:val="404040" w:themeColor="text1" w:themeTint="BF"/>
+          <w:lang w:val="fr-CA"/>
+        </w:rPr>
+        <w:t>.</w:t>
+      </w:r>
+    </w:p>
+    <w:p>
+      <w:pPr>
+        <w:pStyle w:val="Subtitle"/>
+        <w:rPr>
+          <w:color w:val="404040" w:themeColor="text1" w:themeTint="BF"/>
+          <w:lang w:val="fr-CA"/>
+        </w:rPr>
+      </w:pPr>
+    </w:p>
+    <w:p>
+      <w:pPr>
+        <w:pStyle w:val="Subtitle"/>
+        <w:rPr>
+          <w:color w:val="404040" w:themeColor="text1" w:themeTint="BF"/>
+          <w:lang w:val="fr-CA"/>
+        </w:rPr>
+      </w:pPr>
+      <w:r>
+        <w:rPr>
+          <w:color w:val="404040" w:themeColor="text1" w:themeTint="BF"/>
+          <w:lang w:val="fr-CA"/>
+        </w:rPr>
+        <w:t>Carry-Out du 4017 :</w:t>
+      </w:r>
+    </w:p>
+    <w:p>
+      <w:pPr>
+        <w:pStyle w:val="Subtitle"/>
+        <w:rPr>
+          <w:color w:val="404040" w:themeColor="text1" w:themeTint="BF"/>
+          <w:lang w:val="fr-CA"/>
+        </w:rPr>
+      </w:pPr>
+      <w:r>
+        <w:rPr>
+          <w:color w:val="404040" w:themeColor="text1" w:themeTint="BF"/>
+          <w:lang w:val="fr-CA"/>
+        </w:rPr>
+        <w:t>.</w:t>
+      </w:r>
+    </w:p>
+    <w:p>
+      <w:pPr>
+        <w:pStyle w:val="Subtitle"/>
+        <w:rPr>
+          <w:color w:val="404040" w:themeColor="text1" w:themeTint="BF"/>
+          <w:lang w:val="fr-CA"/>
+        </w:rPr>
+      </w:pPr>
+      <w:r>
+        <w:rPr>
+          <w:color w:val="404040" w:themeColor="text1" w:themeTint="BF"/>
+          <w:lang w:val="fr-CA"/>
+        </w:rPr>
+        <w:t>.</w:t>
+      </w:r>
+    </w:p>
+    <w:p>
+      <w:pPr>
+        <w:pStyle w:val="Subtitle"/>
+        <w:rPr>
+          <w:color w:val="404040" w:themeColor="text1" w:themeTint="BF"/>
+          <w:lang w:val="fr-CA"/>
+        </w:rPr>
+      </w:pPr>
+      <w:r>
+        <w:rPr>
+          <w:color w:val="404040" w:themeColor="text1" w:themeTint="BF"/>
+          <w:lang w:val="fr-CA"/>
+        </w:rPr>
+        <w:t>.</w:t>
+      </w:r>
+    </w:p>
+    <w:p>
+      <w:pPr>
+        <w:pStyle w:val="Subtitle"/>
+        <w:rPr>
+          <w:color w:val="404040" w:themeColor="text1" w:themeTint="BF"/>
+          <w:lang w:val="fr-CA"/>
+        </w:rPr>
+      </w:pPr>
+      <w:r>
+        <w:rPr>
+          <w:color w:val="404040" w:themeColor="text1" w:themeTint="BF"/>
+          <w:lang w:val="fr-CA"/>
+        </w:rPr>
+        <w:t>.</w:t>
+      </w:r>
+    </w:p>
+    <w:p>
+      <w:pPr>
+        <w:pStyle w:val="Subtitle"/>
         <w:rPr>
           <w:rStyle w:val="SubtleEmphasis"/>
           <w:i w:val="0"/>
@@ -887,6 +1946,126 @@
     </w:sectPr>
   </w:body>
 </w:document>
+</file>
+
+<file path=word/numbering.xml><?xml version="1.0" encoding="utf-8"?>
+<w:numbering xmlns:wpc="http://schemas.microsoft.com/office/word/2010/wordprocessingCanvas" xmlns:cx="http://schemas.microsoft.com/office/drawing/2014/chartex" xmlns:cx1="http://schemas.microsoft.com/office/drawing/2015/9/8/chartex" xmlns:cx2="http://schemas.microsoft.com/office/drawing/2015/10/21/chartex" xmlns:cx3="http://schemas.microsoft.com/office/drawing/2016/5/9/chartex" xmlns:cx4="http://schemas.microsoft.com/office/drawing/2016/5/10/chartex" xmlns:cx5="http://schemas.microsoft.com/office/drawing/2016/5/11/chartex" xmlns:cx6="http://schemas.microsoft.com/office/drawing/2016/5/12/chartex" xmlns:cx7="http://schemas.microsoft.com/office/drawing/2016/5/13/chartex" xmlns:cx8="http://schemas.microsoft.com/office/drawing/2016/5/14/chartex" xmlns:mc="http://schemas.openxmlformats.org/markup-compatibility/2006" xmlns:aink="http://schemas.microsoft.com/office/drawing/2016/ink" xmlns:am3d="http://schemas.microsoft.com/office/drawing/2017/model3d" xmlns:o="urn:schemas-microsoft-com:office:office" xmlns:oel="http://schemas.microsoft.com/office/2019/extlst" xmlns:r="http://schemas.openxmlformats.org/officeDocument/2006/relationships" xmlns:m="http://schemas.openxmlformats.org/officeDocument/2006/math" xmlns:v="urn:schemas-microsoft-com:vml" xmlns:wp14="http://schemas.microsoft.com/office/word/2010/wordprocessingDrawing" xmlns:wp="http://schemas.openxmlformats.org/drawingml/2006/wordprocessingDrawing" xmlns:w10="urn:schemas-microsoft-com:office:word" xmlns:w="http://schemas.openxmlformats.org/wordprocessingml/2006/main" xmlns:w14="http://schemas.microsoft.com/office/word/2010/wordml" xmlns:w15="http://schemas.microsoft.com/office/word/2012/wordml" xmlns:w16cex="http://schemas.microsoft.com/office/word/2018/wordml/cex" xmlns:w16cid="http://schemas.microsoft.com/office/word/2016/wordml/cid" xmlns:w16="http://schemas.microsoft.com/office/word/2018/wordml" xmlns:w16du="http://schemas.microsoft.com/office/word/2023/wordml/word16du" xmlns:w16sdtdh="http://schemas.microsoft.com/office/word/2020/wordml/sdtdatahash" xmlns:w16sdtfl="http://schemas.microsoft.com/office/word/2024/wordml/sdtformatlock" xmlns:w16se="http://schemas.microsoft.com/office/word/2015/wordml/symex" xmlns:wpg="http://schemas.microsoft.com/office/word/2010/wordprocessingGroup" xmlns:wpi="http://schemas.microsoft.com/office/word/2010/wordprocessingInk" xmlns:wne="http://schemas.microsoft.com/office/word/2006/wordml" xmlns:wps="http://schemas.microsoft.com/office/word/2010/wordprocessingShape" mc:Ignorable="w14 w15 w16se w16cid w16 w16cex w16sdtdh w16sdtfl w16du wp14">
+  <w:abstractNum w:abstractNumId="0" w15:restartNumberingAfterBreak="0">
+    <w:nsid w:val="51E44F5C"/>
+    <w:multiLevelType w:val="hybridMultilevel"/>
+    <w:tmpl w:val="D2C6B3CE"/>
+    <w:lvl w:ilvl="0" w:tplc="3E06E932">
+      <w:numFmt w:val="bullet"/>
+      <w:lvlText w:val="-"/>
+      <w:lvlJc w:val="left"/>
+      <w:pPr>
+        <w:ind w:left="720" w:hanging="360"/>
+      </w:pPr>
+      <w:rPr>
+        <w:rFonts w:ascii="Aptos" w:eastAsiaTheme="minorHAnsi" w:hAnsi="Aptos" w:cstheme="minorBidi" w:hint="default"/>
+      </w:rPr>
+    </w:lvl>
+    <w:lvl w:ilvl="1" w:tplc="10090003" w:tentative="1">
+      <w:start w:val="1"/>
+      <w:numFmt w:val="bullet"/>
+      <w:lvlText w:val="o"/>
+      <w:lvlJc w:val="left"/>
+      <w:pPr>
+        <w:ind w:left="1440" w:hanging="360"/>
+      </w:pPr>
+      <w:rPr>
+        <w:rFonts w:ascii="Courier New" w:hAnsi="Courier New" w:cs="Courier New" w:hint="default"/>
+      </w:rPr>
+    </w:lvl>
+    <w:lvl w:ilvl="2" w:tplc="10090005" w:tentative="1">
+      <w:start w:val="1"/>
+      <w:numFmt w:val="bullet"/>
+      <w:lvlText w:val=""/>
+      <w:lvlJc w:val="left"/>
+      <w:pPr>
+        <w:ind w:left="2160" w:hanging="360"/>
+      </w:pPr>
+      <w:rPr>
+        <w:rFonts w:ascii="Wingdings" w:hAnsi="Wingdings" w:hint="default"/>
+      </w:rPr>
+    </w:lvl>
+    <w:lvl w:ilvl="3" w:tplc="10090001" w:tentative="1">
+      <w:start w:val="1"/>
+      <w:numFmt w:val="bullet"/>
+      <w:lvlText w:val=""/>
+      <w:lvlJc w:val="left"/>
+      <w:pPr>
+        <w:ind w:left="2880" w:hanging="360"/>
+      </w:pPr>
+      <w:rPr>
+        <w:rFonts w:ascii="Symbol" w:hAnsi="Symbol" w:hint="default"/>
+      </w:rPr>
+    </w:lvl>
+    <w:lvl w:ilvl="4" w:tplc="10090003" w:tentative="1">
+      <w:start w:val="1"/>
+      <w:numFmt w:val="bullet"/>
+      <w:lvlText w:val="o"/>
+      <w:lvlJc w:val="left"/>
+      <w:pPr>
+        <w:ind w:left="3600" w:hanging="360"/>
+      </w:pPr>
+      <w:rPr>
+        <w:rFonts w:ascii="Courier New" w:hAnsi="Courier New" w:cs="Courier New" w:hint="default"/>
+      </w:rPr>
+    </w:lvl>
+    <w:lvl w:ilvl="5" w:tplc="10090005" w:tentative="1">
+      <w:start w:val="1"/>
+      <w:numFmt w:val="bullet"/>
+      <w:lvlText w:val=""/>
+      <w:lvlJc w:val="left"/>
+      <w:pPr>
+        <w:ind w:left="4320" w:hanging="360"/>
+      </w:pPr>
+      <w:rPr>
+        <w:rFonts w:ascii="Wingdings" w:hAnsi="Wingdings" w:hint="default"/>
+      </w:rPr>
+    </w:lvl>
+    <w:lvl w:ilvl="6" w:tplc="10090001" w:tentative="1">
+      <w:start w:val="1"/>
+      <w:numFmt w:val="bullet"/>
+      <w:lvlText w:val=""/>
+      <w:lvlJc w:val="left"/>
+      <w:pPr>
+        <w:ind w:left="5040" w:hanging="360"/>
+      </w:pPr>
+      <w:rPr>
+        <w:rFonts w:ascii="Symbol" w:hAnsi="Symbol" w:hint="default"/>
+      </w:rPr>
+    </w:lvl>
+    <w:lvl w:ilvl="7" w:tplc="10090003" w:tentative="1">
+      <w:start w:val="1"/>
+      <w:numFmt w:val="bullet"/>
+      <w:lvlText w:val="o"/>
+      <w:lvlJc w:val="left"/>
+      <w:pPr>
+        <w:ind w:left="5760" w:hanging="360"/>
+      </w:pPr>
+      <w:rPr>
+        <w:rFonts w:ascii="Courier New" w:hAnsi="Courier New" w:cs="Courier New" w:hint="default"/>
+      </w:rPr>
+    </w:lvl>
+    <w:lvl w:ilvl="8" w:tplc="10090005" w:tentative="1">
+      <w:start w:val="1"/>
+      <w:numFmt w:val="bullet"/>
+      <w:lvlText w:val=""/>
+      <w:lvlJc w:val="left"/>
+      <w:pPr>
+        <w:ind w:left="6480" w:hanging="360"/>
+      </w:pPr>
+      <w:rPr>
+        <w:rFonts w:ascii="Wingdings" w:hAnsi="Wingdings" w:hint="default"/>
+      </w:rPr>
+    </w:lvl>
+  </w:abstractNum>
+  <w:num w:numId="1" w16cid:durableId="1715108812">
+    <w:abstractNumId w:val="0"/>
+  </w:num>
+</w:numbering>
 </file>
 
 <file path=word/styles.xml><?xml version="1.0" encoding="utf-8"?>
@@ -1492,7 +2671,6 @@
   <w:style w:type="character" w:default="1" w:styleId="DefaultParagraphFont">
     <w:name w:val="Default Paragraph Font"/>
     <w:uiPriority w:val="1"/>
-    <w:semiHidden/>
     <w:unhideWhenUsed/>
   </w:style>
   <w:style w:type="table" w:default="1" w:styleId="TableNormal">
@@ -1817,6 +2995,25 @@
       <w:iCs/>
       <w:color w:val="404040" w:themeColor="text1" w:themeTint="BF"/>
     </w:rPr>
+  </w:style>
+  <w:style w:type="table" w:styleId="TableGrid">
+    <w:name w:val="Table Grid"/>
+    <w:basedOn w:val="TableNormal"/>
+    <w:uiPriority w:val="39"/>
+    <w:rsid w:val="00933D42"/>
+    <w:pPr>
+      <w:spacing w:after="0" w:line="240" w:lineRule="auto"/>
+    </w:pPr>
+    <w:tblPr>
+      <w:tblBorders>
+        <w:top w:val="single" w:sz="4" w:space="0" w:color="auto"/>
+        <w:left w:val="single" w:sz="4" w:space="0" w:color="auto"/>
+        <w:bottom w:val="single" w:sz="4" w:space="0" w:color="auto"/>
+        <w:right w:val="single" w:sz="4" w:space="0" w:color="auto"/>
+        <w:insideH w:val="single" w:sz="4" w:space="0" w:color="auto"/>
+        <w:insideV w:val="single" w:sz="4" w:space="0" w:color="auto"/>
+      </w:tblBorders>
+    </w:tblPr>
   </w:style>
 </w:styles>
 </file>

</xml_diff>